<commit_message>
chore: update project documentation files and remove unnecessary lock file
</commit_message>
<xml_diff>
--- a/docs/dossier projet/Dossier_projet_PromptVerse_Abduljaber_v2.docx
+++ b/docs/dossier projet/Dossier_projet_PromptVerse_Abduljaber_v2.docx
@@ -132,6 +132,28 @@
           <w:sz w:val="24"/>
           <w:szCs w:val="24"/>
         </w:rPr>
+        <w:t xml:space="preserve">Équipe projet : </w:t>
+      </w:r>
+      <w:r>
+        <w:rPr>
+          <w:sz w:val="24"/>
+          <w:szCs w:val="24"/>
+        </w:rPr>
+        <w:t xml:space="preserve">Abduljaber, Amine et Anis</w:t>
+      </w:r>
+    </w:p>
+    <w:p>
+      <w:pPr>
+        <w:spacing w:before="0" w:after="60"/>
+        <w:jc w:val="center"/>
+      </w:pPr>
+      <w:r>
+        <w:rPr>
+          <w:b/>
+          <w:color w:val="0B3D91"/>
+          <w:sz w:val="24"/>
+          <w:szCs w:val="24"/>
+        </w:rPr>
         <w:t xml:space="preserve">Titre professionnel visé : </w:t>
       </w:r>
       <w:r>
@@ -1561,7 +1583,7 @@
       </w:pPr>
       <w:r>
         <w:rPr/>
-        <w:t xml:space="preserve">Le projet PromptVerse couvre les trois activités types du titre professionnel Concepteur Développeur d’Applications. J’ai conçu et développé seul l’ensemble de l’application : chaque compétence ci-dessous a donc été mise en œuvre directement par moi. La dernière colonne indique où trouver les éléments qui la démontrent dans ce dossier.</w:t>
+        <w:t xml:space="preserve">Le projet PromptVerse couvre les trois activités types du titre professionnel Concepteur Développeur d’Applications. Le projet a été réalisé en équipe de trois apprenants — Abduljaber, Amine et Anis — et j’ai participé à chacune des étapes décrites ci-dessous, de la conception au déploiement. La dernière colonne indique où trouver les éléments qui démontrent chaque compétence dans ce dossier.</w:t>
       </w:r>
     </w:p>
     <w:tbl>
@@ -2606,7 +2628,7 @@
       </w:pPr>
       <w:r>
         <w:rPr/>
-        <w:t xml:space="preserve">I designed and developed the whole project on my own, from the requirements and the UML and Merise models to production. Each feature was specified before being coded. The application is containerized with Docker, and a GitHub Actions pipeline runs the tests, builds the images, pushes them to Docker Hub and deploys them to a VPS behind Nginx with HTTPS.</w:t>
+        <w:t xml:space="preserve">The project was carried out by a team of three trainees (Abduljaber, Amine and Anis), from the requirements and the UML and Merise models to production, and I took part in every stage. Each feature was specified before being coded. The application is containerized with Docker, and a GitHub Actions pipeline runs the tests, builds the images, pushes them to Docker Hub and deploys them to a VPS behind Nginx with HTTPS.</w:t>
       </w:r>
     </w:p>
     <w:p>
@@ -3315,7 +3337,7 @@
                 <w:sz w:val="19"/>
                 <w:szCs w:val="19"/>
               </w:rPr>
-              <w:t xml:space="preserve">Projet réalisé seul, en méthode Agile Scrum, avec une démarche guidée par les spécifications.</w:t>
+              <w:t xml:space="preserve">Projet réalisé en équipe de trois, en méthode Agile Scrum, avec une démarche guidée par les spécifications.</w:t>
             </w:r>
           </w:p>
         </w:tc>
@@ -4144,17 +4166,17 @@
       </w:pPr>
       <w:r>
         <w:rPr/>
-        <w:t xml:space="preserve">J’ai organisé le projet selon une approche </w:t>
+        <w:t xml:space="preserve">Notre équipe de trois a organisé le projet selon une approche </w:t>
       </w:r>
       <w:r>
         <w:rPr>
           <w:b/>
         </w:rPr>
-        <w:t xml:space="preserve">Agile Scrum adaptée à un développeur seul</w:t>
-      </w:r>
-      <w:r>
-        <w:rPr/>
-        <w:t xml:space="preserve"> : le travail est découpé en huit sprints courts, chacun avec un objectif, un ensemble de tickets et une définition de « terminé ». À la fin de chaque sprint, je vérifiais que les critères d’acceptation étaient respectés avant de passer au suivant.</w:t>
+        <w:t xml:space="preserve">Agile Scrum</w:t>
+      </w:r>
+      <w:r>
+        <w:rPr/>
+        <w:t xml:space="preserve"> : le travail est découpé en huit sprints courts, chacun avec un objectif, un ensemble de tickets et une définition de « terminé ». Les tâches du backlog étaient réparties entre nous, et à la fin de chaque sprint nous vérifiions ensemble que les critères d’acceptation étaient respectés avant de passer au suivant.</w:t>
       </w:r>
     </w:p>
     <w:p>
@@ -4163,7 +4185,7 @@
       </w:pPr>
       <w:r>
         <w:rPr/>
-        <w:t xml:space="preserve">J’ai combiné cette organisation avec une démarche </w:t>
+        <w:t xml:space="preserve">Nous avons combiné cette organisation avec une démarche </w:t>
       </w:r>
       <w:r>
         <w:rPr>
@@ -4193,7 +4215,7 @@
       </w:r>
       <w:r>
         <w:rPr/>
-        <w:t xml:space="preserve"> : avant de coder un module, je rédigeais une proposition versionnée dans le dépôt (besoin, conception, critères d’acceptation, liste de tâches). Le code découle ainsi directement d’une spécification validée, et les critères d’acceptation deviennent la liste des tests à écrire.</w:t>
+        <w:t xml:space="preserve"> : avant de coder un module, une proposition était rédigée et versionnée dans le dépôt (besoin, conception, critères d’acceptation, liste de tâches). Le code découle ainsi directement d’une spécification validée, et les critères d’acceptation deviennent la liste des tests à écrire.</w:t>
       </w:r>
     </w:p>
     <w:p>
@@ -4212,7 +4234,7 @@
       </w:r>
       <w:r>
         <w:rPr/>
-        <w:t xml:space="preserve"> pour reformuler des spécifications, proposer des pistes de structure et relire du code. Chaque proposition a été vérifiée, testée et adaptée avant d’être intégrée : les choix finaux et la validation sont restés sous ma responsabilité.</w:t>
+        <w:t xml:space="preserve"> pour reformuler des spécifications, proposer des pistes de structure et relire du code. Chaque proposition a été vérifiée, testée et adaptée avant d’être intégrée : les choix finaux et la validation sont restés sous la responsabilité de l’équipe.</w:t>
       </w:r>
     </w:p>
     <w:p>
@@ -5443,7 +5465,46 @@
       </w:r>
       <w:r>
         <w:rPr/>
-        <w:t xml:space="preserve"> J’ai réalisé le projet seul. Les briefs de sprint étaient fournis par mon formateur, avec qui je faisais le point sur l’avancement et les livrables. La documentation officielle des outils (NestJS, Stripe, TypeORM, React) a été ma principale ressource.</w:t>
+        <w:t xml:space="preserve"> Le projet a été réalisé en équipe de trois apprenants : </w:t>
+      </w:r>
+      <w:r>
+        <w:rPr>
+          <w:b/>
+        </w:rPr>
+        <w:t xml:space="preserve">Abduljaber</w:t>
+      </w:r>
+      <w:r>
+        <w:rPr/>
+        <w:t xml:space="preserve"> (moi-même), </w:t>
+      </w:r>
+      <w:r>
+        <w:rPr>
+          <w:b/>
+        </w:rPr>
+        <w:t xml:space="preserve">Amine</w:t>
+      </w:r>
+      <w:r>
+        <w:rPr/>
+        <w:t xml:space="preserve"> et </w:t>
+      </w:r>
+      <w:r>
+        <w:rPr>
+          <w:b/>
+        </w:rPr>
+        <w:t xml:space="preserve">Anis</w:t>
+      </w:r>
+      <w:r>
+        <w:rPr/>
+        <w:t xml:space="preserve">. Nous travaillions sur un dépôt GitHub commun, avec un backlog Trello partagé pour répartir les tâches et suivre l’avancement, et des points réguliers pour faire le bilan, lever les blocages et prendre les décisions techniques ensemble. Les briefs de sprint étaient fournis par notre formateur, avec qui nous faisions le point sur les livrables. La documentation officielle des outils (NestJS, Stripe, TypeORM, React) a été notre principale ressource.</w:t>
+      </w:r>
+    </w:p>
+    <w:p>
+      <w:pPr>
+        <w:jc w:val="both"/>
+      </w:pPr>
+      <w:r>
+        <w:rPr/>
+        <w:t xml:space="preserve">Les extraits de code et les réalisations détaillés dans les sections 7 à 12 correspondent à des parties auxquelles j’ai directement contribué : authentification, catalogue et prompts, administration, achat avec Stripe, tests unitaires, conteneurisation et déploiement.</w:t>
       </w:r>
     </w:p>
     <w:tbl>
@@ -23839,7 +23900,7 @@
       </w:pPr>
       <w:r>
         <w:rPr/>
-        <w:t xml:space="preserve">PromptVerse a été pour moi un projet complet et exigeant, mené seul de bout en bout. Partir d’un besoin, le formaliser en user stories et en spécifications, le modéliser avec UML et Merise, puis le transformer en une application testée et déployée m’a fait parcourir tout le cycle de vie d’une application, et pas seulement sa partie la plus visible.</w:t>
+        <w:t xml:space="preserve">PromptVerse a été pour moi un projet complet et exigeant, mené en équipe avec Amine et Anis. Partir d’un besoin, le formaliser en user stories et en spécifications, le modéliser avec UML et Merise, puis le transformer en une application testée et déployée m’a fait parcourir tout le cycle de vie d’une application, et pas seulement sa partie la plus visible.</w:t>
       </w:r>
     </w:p>
     <w:p>
@@ -23866,7 +23927,7 @@
       </w:pPr>
       <w:r>
         <w:rPr/>
-        <w:t xml:space="preserve">Le jeu d’essai et la veille de sécurité m’ont aussi montré les limites actuelles du projet, que j’assume et que j’ai planifiées : usage réel du cache Redis, durcissement de l’envoi de fichiers, mise à jour des dépendances et extension des tests. Le socle est solide et a été conçu pour accueillir ces évolutions sans être réécrit.</w:t>
+        <w:t xml:space="preserve">Travailler à trois m’a également appris à me coordonner au quotidien : répartir les tâches, partager un même dépôt Git, expliquer mes choix techniques et intégrer le travail des autres. Le jeu d’essai et la veille de sécurité m’ont aussi montré les limites actuelles du projet, que j’assume et que j’ai planifiées : usage réel du cache Redis, durcissement de l’envoi de fichiers, mise à jour des dépendances et extension des tests. Le socle est solide et a été conçu pour accueillir ces évolutions sans être réécrit.</w:t>
       </w:r>
     </w:p>
     <w:p>

</xml_diff>